<commit_message>
User guides: remove the download URL from both covers
Co-Authored-By: Claude Opus 5.5 <noreply@anthropic.com>
Claude-Session: https://claude.ai/code/session_01KhQt6DAWzFQD8wwDFofesM
</commit_message>
<xml_diff>
--- a/docs/MarkItDown-Guide-en.docx
+++ b/docs/MarkItDown-Guide-en.docx
@@ -49,7 +49,7 @@
     </w:p>
     <w:p>
       <w:pPr>
-        <w:spacing w:after="60"/>
+        <w:spacing w:after="600"/>
       </w:pPr>
       <w:r>
         <w:rPr>
@@ -57,18 +57,6 @@
           <w:color w:val="5D5D5D"/>
         </w:rPr>
         <w:t xml:space="preserve">Version: v1.7.0</w:t>
-      </w:r>
-    </w:p>
-    <w:p>
-      <w:pPr>
-        <w:spacing w:after="600"/>
-      </w:pPr>
-      <w:r>
-        <w:rPr>
-          <w:rFonts w:ascii="Segoe UI" w:cs="Segoe UI" w:eastAsia="Microsoft JhengHei" w:hAnsi="Segoe UI"/>
-          <w:color w:val="5D5D5D"/>
-        </w:rPr>
-        <w:t xml:space="preserve">Download: https://github.com/hsu19970520/blank-app/releases/latest</w:t>
       </w:r>
     </w:p>
     <w:p>

</xml_diff>

<commit_message>
Release the user guides as v1.7.1
The release workflow cannot update an existing release ("Resource not
accessible by integration"), so the guides ship in a new release instead
of being re-attached to v1.7.0. Program behaviour is unchanged; version
strings in the app and both guides read 1.7.1.

Co-Authored-By: Claude Opus 5.5 <noreply@anthropic.com>
Claude-Session: https://claude.ai/code/session_01KhQt6DAWzFQD8wwDFofesM
</commit_message>
<xml_diff>
--- a/docs/MarkItDown-Guide-en.docx
+++ b/docs/MarkItDown-Guide-en.docx
@@ -56,7 +56,7 @@
           <w:rFonts w:ascii="Segoe UI" w:cs="Segoe UI" w:eastAsia="Microsoft JhengHei" w:hAnsi="Segoe UI"/>
           <w:color w:val="5D5D5D"/>
         </w:rPr>
-        <w:t xml:space="preserve">Version: v1.7.0</w:t>
+        <w:t xml:space="preserve">Version: v1.7.1</w:t>
       </w:r>
     </w:p>
     <w:p>
@@ -7179,7 +7179,7 @@
         <w:sz w:val="18"/>
         <w:szCs w:val="18"/>
       </w:rPr>
-      <w:t xml:space="preserve">MarkItDown Converter User Guide v1.7.0 · Page </w:t>
+      <w:t xml:space="preserve">MarkItDown Converter User Guide v1.7.1 · Page </w:t>
     </w:r>
     <w:r>
       <w:rPr>

</xml_diff>